<commit_message>
Bring the abstract under the journal's 250-word cap
It stood at 258. The cut is in the opening two sentences and the closing one,
none of which carried a result.
</commit_message>
<xml_diff>
--- a/docs/eriksen_et_al_2026/revision/eriksen_et_al_2026_manuscript_ako.docx
+++ b/docs/eriksen_et_al_2026/revision/eriksen_et_al_2026_manuscript_ako.docx
@@ -30,7 +30,7 @@
       </w:del>
       <w:ins w:id="2647" w:author="Albert Kwame Osei-Owusu" w:date="2026-09-12T09:00:00Z">
         <w:r>
-          <w:t xml:space="preserve">Health care systems rely on energy and materials whose environmental impacts extend across global supply chains and are not captured by facility-level assessment. We quantified the environmental impacts of delivering health care in Denmark in 2022 using environmentally extended multi-regional input-output (EE-MRIO) analysis with bottom-up complements. Health care demand was built from Statistics Denmark's published 117-industry input-output table and linked to global supply chains through EXIOBASE version 3.8.2, so that the demand year and the model year coincide and no deflation is required. Parameter uncertainty was propagated by Monte Carlo simulation with 100,000 draws. Danish health care was responsible for 4,652 kilotonnes of carbon dioxide equivalent </w:t>
+          <w:t xml:space="preserve">Health care relies on energy and materials whose environmental impacts cross global supply chains and escape facility-level assessment. We quantified those impacts for Denmark in 2022 using environmentally extended multi-regional input-output (EE-MRIO) analysis with bottom-up complements. Health care demand was built from Statistics Denmark's published 117-industry input-output table and linked to global supply chains through EXIOBASE version 3.8.2, so that the demand year and the model year coincide and no deflation is required. Parameter uncertainty was propagated by Monte Carlo simulation with 100,000 draws. Danish health care was responsible for 4,652 kilotonnes of carbon dioxide equivalent </w:t>
         </w:r>
       </w:ins>
       <w:ins w:id="6113" w:author="Albert Kwame Osei-Owusu" w:date="2026-09-12T09:00:00Z">
@@ -115,7 +115,7 @@
       </w:ins>
       <w:ins w:id="6130" w:author="Albert Kwame Osei-Owusu" w:date="2026-09-12T09:00:00Z">
         <w:r>
-          <w:t xml:space="preserve"> in 99.99% of draws, and the width of the intervals is set by the input-output data rather than by the Danish primary data. Mitigation must extend beyond health care facilities to procurement, pharmaceutical supply, travel and food systems.</w:t>
+          <w:t xml:space="preserve"> in 99.99% of draws, and the interval width is set by the input-output data rather than the Danish primary data. Mitigation must reach beyond health care facilities to procurement, pharmaceutical supply, travel and food systems.</w:t>
         </w:r>
       </w:ins>
     </w:p>

</xml_diff>